<commit_message>
Update: Reflexion Umsetzung Filterfunktion
</commit_message>
<xml_diff>
--- a/reflexion.docx
+++ b/reflexion.docx
@@ -65,23 +65,7 @@
           <w:sz w:val="22"/>
           <w:szCs w:val="22"/>
         </w:rPr>
-        <w:t xml:space="preserve">Ich habe mich </w:t>
-      </w:r>
-      <w:r>
-        <w:rPr>
-          <w:rFonts w:ascii="Arial" w:hAnsi="Arial"/>
-          <w:sz w:val="22"/>
-          <w:szCs w:val="22"/>
-        </w:rPr>
-        <w:t>für</w:t>
-      </w:r>
-      <w:r>
-        <w:rPr>
-          <w:rFonts w:ascii="Arial" w:hAnsi="Arial"/>
-          <w:sz w:val="22"/>
-          <w:szCs w:val="22"/>
-        </w:rPr>
-        <w:t xml:space="preserve"> eine Webseite zur Geschichte Chinas entschieden, weil ich selbst mehr als</w:t>
+        <w:t>Ich habe mich für eine Webseite zur Geschichte Chinas entschieden, weil ich selbst mehr als</w:t>
       </w:r>
       <w:r>
         <w:rPr>
@@ -97,15 +81,7 @@
           <w:sz w:val="22"/>
           <w:szCs w:val="22"/>
         </w:rPr>
-        <w:t>fünf</w:t>
-      </w:r>
-      <w:r>
-        <w:rPr>
-          <w:rFonts w:ascii="Arial" w:hAnsi="Arial"/>
-          <w:sz w:val="22"/>
-          <w:szCs w:val="22"/>
-        </w:rPr>
-        <w:t xml:space="preserve"> Jahre in China gelebt habe. Seitdem interessieren mich das Land und seine Geschichte</w:t>
+        <w:t>fünf Jahre in China gelebt habe. Seitdem interessieren mich das Land und seine Geschichte</w:t>
       </w:r>
       <w:r>
         <w:rPr>
@@ -123,16 +99,6 @@
         </w:rPr>
         <w:t>besonders.</w:t>
       </w:r>
-    </w:p>
-    <w:p>
-      <w:pPr>
-        <w:jc w:val="both"/>
-        <w:rPr>
-          <w:rFonts w:ascii="Arial" w:hAnsi="Arial"/>
-          <w:sz w:val="22"/>
-          <w:szCs w:val="22"/>
-        </w:rPr>
-      </w:pPr>
     </w:p>
     <w:p>
       <w:pPr>
@@ -197,23 +163,7 @@
           <w:sz w:val="22"/>
           <w:szCs w:val="22"/>
         </w:rPr>
-        <w:t xml:space="preserve"> war </w:t>
-      </w:r>
-      <w:r>
-        <w:rPr>
-          <w:rFonts w:ascii="Arial" w:hAnsi="Arial"/>
-          <w:sz w:val="22"/>
-          <w:szCs w:val="22"/>
-        </w:rPr>
-        <w:t>für</w:t>
-      </w:r>
-      <w:r>
-        <w:rPr>
-          <w:rFonts w:ascii="Arial" w:hAnsi="Arial"/>
-          <w:sz w:val="22"/>
-          <w:szCs w:val="22"/>
-        </w:rPr>
-        <w:t xml:space="preserve"> mich die größte </w:t>
+        <w:t xml:space="preserve"> war für mich die größte </w:t>
       </w:r>
       <w:r>
         <w:rPr>
@@ -263,14 +213,6 @@
           <w:sz w:val="22"/>
           <w:szCs w:val="22"/>
         </w:rPr>
-        <w:t xml:space="preserve"> Abgesehen von den</w:t>
-      </w:r>
-      <w:r>
-        <w:rPr>
-          <w:rFonts w:ascii="Arial" w:hAnsi="Arial"/>
-          <w:sz w:val="22"/>
-          <w:szCs w:val="22"/>
-        </w:rPr>
         <w:t xml:space="preserve"> </w:t>
       </w:r>
       <w:r>
@@ -279,6 +221,22 @@
           <w:sz w:val="22"/>
           <w:szCs w:val="22"/>
         </w:rPr>
+        <w:t>Abgesehen von den</w:t>
+      </w:r>
+      <w:r>
+        <w:rPr>
+          <w:rFonts w:ascii="Arial" w:hAnsi="Arial"/>
+          <w:sz w:val="22"/>
+          <w:szCs w:val="22"/>
+        </w:rPr>
+        <w:t xml:space="preserve"> </w:t>
+      </w:r>
+      <w:r>
+        <w:rPr>
+          <w:rFonts w:ascii="Arial" w:hAnsi="Arial"/>
+          <w:sz w:val="22"/>
+          <w:szCs w:val="22"/>
+        </w:rPr>
         <w:t xml:space="preserve">Übungen aus Modul 2 habe ich bisher kaum mit JavaScript oder </w:t>
       </w:r>
       <w:proofErr w:type="spellStart"/>
@@ -378,14 +336,6 @@
           <w:szCs w:val="22"/>
         </w:rPr>
         <w:t xml:space="preserve">vor einigen Jahren kurz zu tun. </w:t>
-      </w:r>
-      <w:r>
-        <w:rPr>
-          <w:rFonts w:ascii="Arial" w:hAnsi="Arial"/>
-          <w:sz w:val="22"/>
-          <w:szCs w:val="22"/>
-        </w:rPr>
-        <w:t>Bei der Umsetzung habe ich bei Schwierigkeiten das KI-Tool Codex befragt. (Früher hätte ich wohl auf stackoverflow.com nachgesehen.)</w:t>
       </w:r>
     </w:p>
     <w:p>
@@ -397,6 +347,168 @@
           <w:szCs w:val="22"/>
         </w:rPr>
       </w:pPr>
+      <w:r>
+        <w:rPr>
+          <w:rFonts w:ascii="Arial" w:hAnsi="Arial"/>
+          <w:sz w:val="22"/>
+          <w:szCs w:val="22"/>
+        </w:rPr>
+        <w:t>Für die Umsetzung</w:t>
+      </w:r>
+      <w:r>
+        <w:rPr>
+          <w:rFonts w:ascii="Arial" w:hAnsi="Arial"/>
+          <w:sz w:val="22"/>
+          <w:szCs w:val="22"/>
+        </w:rPr>
+        <w:t xml:space="preserve"> der Filterfunktion</w:t>
+      </w:r>
+      <w:r>
+        <w:rPr>
+          <w:rFonts w:ascii="Arial" w:hAnsi="Arial"/>
+          <w:sz w:val="22"/>
+          <w:szCs w:val="22"/>
+        </w:rPr>
+        <w:t xml:space="preserve"> habe</w:t>
+      </w:r>
+      <w:r>
+        <w:rPr>
+          <w:rFonts w:ascii="Arial" w:hAnsi="Arial"/>
+          <w:sz w:val="22"/>
+          <w:szCs w:val="22"/>
+        </w:rPr>
+        <w:t xml:space="preserve"> ich</w:t>
+      </w:r>
+      <w:r>
+        <w:rPr>
+          <w:rFonts w:ascii="Arial" w:hAnsi="Arial"/>
+          <w:sz w:val="22"/>
+          <w:szCs w:val="22"/>
+        </w:rPr>
+        <w:t xml:space="preserve"> die </w:t>
+      </w:r>
+      <w:r>
+        <w:rPr>
+          <w:rFonts w:ascii="Arial" w:hAnsi="Arial"/>
+          <w:sz w:val="22"/>
+          <w:szCs w:val="22"/>
+        </w:rPr>
+        <w:t>Geschichtsabschnitte</w:t>
+      </w:r>
+      <w:r>
+        <w:rPr>
+          <w:rFonts w:ascii="Arial" w:hAnsi="Arial"/>
+          <w:sz w:val="22"/>
+          <w:szCs w:val="22"/>
+        </w:rPr>
+        <w:t xml:space="preserve"> mit </w:t>
+      </w:r>
+      <w:proofErr w:type="spellStart"/>
+      <w:r>
+        <w:rPr>
+          <w:rFonts w:ascii="Arial" w:hAnsi="Arial"/>
+          <w:sz w:val="22"/>
+          <w:szCs w:val="22"/>
+        </w:rPr>
+        <w:t>data</w:t>
+      </w:r>
+      <w:proofErr w:type="spellEnd"/>
+      <w:r>
+        <w:rPr>
+          <w:rFonts w:ascii="Arial" w:hAnsi="Arial"/>
+          <w:sz w:val="22"/>
+          <w:szCs w:val="22"/>
+        </w:rPr>
+        <w:t xml:space="preserve">-epoche kategorisiert, die passenden Einträge mit </w:t>
+      </w:r>
+      <w:proofErr w:type="spellStart"/>
+      <w:proofErr w:type="gramStart"/>
+      <w:r>
+        <w:rPr>
+          <w:rFonts w:ascii="Arial" w:hAnsi="Arial"/>
+          <w:sz w:val="22"/>
+          <w:szCs w:val="22"/>
+        </w:rPr>
+        <w:t>filter</w:t>
+      </w:r>
+      <w:proofErr w:type="spellEnd"/>
+      <w:r>
+        <w:rPr>
+          <w:rFonts w:ascii="Arial" w:hAnsi="Arial"/>
+          <w:sz w:val="22"/>
+          <w:szCs w:val="22"/>
+        </w:rPr>
+        <w:t>(</w:t>
+      </w:r>
+      <w:proofErr w:type="gramEnd"/>
+      <w:r>
+        <w:rPr>
+          <w:rFonts w:ascii="Arial" w:hAnsi="Arial"/>
+          <w:sz w:val="22"/>
+          <w:szCs w:val="22"/>
+        </w:rPr>
+        <w:t xml:space="preserve">) ermittelt und sie über </w:t>
+      </w:r>
+      <w:proofErr w:type="spellStart"/>
+      <w:r>
+        <w:rPr>
+          <w:rFonts w:ascii="Arial" w:hAnsi="Arial"/>
+          <w:sz w:val="22"/>
+          <w:szCs w:val="22"/>
+        </w:rPr>
+        <w:t>classList</w:t>
+      </w:r>
+      <w:proofErr w:type="spellEnd"/>
+      <w:r>
+        <w:rPr>
+          <w:rFonts w:ascii="Arial" w:hAnsi="Arial"/>
+          <w:sz w:val="22"/>
+          <w:szCs w:val="22"/>
+        </w:rPr>
+        <w:t xml:space="preserve"> ein- oder ausgeblendet.</w:t>
+      </w:r>
+    </w:p>
+    <w:p>
+      <w:pPr>
+        <w:jc w:val="both"/>
+        <w:rPr>
+          <w:rFonts w:ascii="Arial" w:hAnsi="Arial"/>
+          <w:sz w:val="22"/>
+          <w:szCs w:val="22"/>
+        </w:rPr>
+      </w:pPr>
+      <w:r>
+        <w:rPr>
+          <w:rFonts w:ascii="Arial" w:hAnsi="Arial"/>
+          <w:sz w:val="22"/>
+          <w:szCs w:val="22"/>
+        </w:rPr>
+        <w:t>B</w:t>
+      </w:r>
+      <w:r>
+        <w:rPr>
+          <w:rFonts w:ascii="Arial" w:hAnsi="Arial"/>
+          <w:sz w:val="22"/>
+          <w:szCs w:val="22"/>
+        </w:rPr>
+        <w:t xml:space="preserve">ei Schwierigkeiten </w:t>
+      </w:r>
+      <w:r>
+        <w:rPr>
+          <w:rFonts w:ascii="Arial" w:hAnsi="Arial"/>
+          <w:sz w:val="22"/>
+          <w:szCs w:val="22"/>
+        </w:rPr>
+        <w:t xml:space="preserve">habe ich </w:t>
+      </w:r>
+      <w:r>
+        <w:rPr>
+          <w:rFonts w:ascii="Arial" w:hAnsi="Arial"/>
+          <w:sz w:val="22"/>
+          <w:szCs w:val="22"/>
+        </w:rPr>
+        <w:t>das KI-Tool Codex befragt. (Früher hätte ich wohl auf stackoverflow.com nachgesehen.)</w:t>
+      </w:r>
     </w:p>
     <w:p>
       <w:pPr>
@@ -1915,6 +2027,7 @@
   <w:style w:type="character" w:default="1" w:styleId="DefaultParagraphFont">
     <w:name w:val="Default Paragraph Font"/>
     <w:uiPriority w:val="1"/>
+    <w:semiHidden/>
     <w:unhideWhenUsed/>
   </w:style>
   <w:style w:type="table" w:default="1" w:styleId="TableNormal">

</xml_diff>